<commit_message>
docs(handoff): prepare Session1007 AI transformation construction relay
本批清单 11 条，本次实际装入 9 条（队列 #507 改锚后的自陈，#136 配套）：
- 未装入：0-学习与工具/codex-handoff/Session1007-AI赋能构建接力-2026-10-08.md（已在 HEAD）
- 未装入：0-学习与工具/codex-handoff/开场prompt-AI赋能构建续场-2026-10-08.md（已在 HEAD）
</commit_message>
<xml_diff>
--- a/6-人才与组织/部门AI专员跟进/采购部-姚祖怡-跟进-2026-10-03-SC2真实案例微会准备.docx
+++ b/6-人才与组织/部门AI专员跟进/采购部-姚祖怡-跟进-2026-10-03-SC2真实案例微会准备.docx
@@ -13,7 +13,7 @@
           <w:color w:val="1F4E79"/>
           <w:sz w:val="40"/>
         </w:rPr>
-        <w:t>采购部#25 · SC2真实案例与微会准备</w:t>
+        <w:t>1. 分享一组实际核数记录</w:t>
       </w:r>
     </w:p>
     <w:p/>
@@ -214,6 +214,846 @@
     </w:p>
     <w:p>
       <w:pPr>
+        <w:pStyle w:val="Heading2"/>
+        <w:spacing w:before="260" w:after="120"/>
+      </w:pPr>
+      <w:r>
+        <w:rPr>
+          <w:rFonts w:ascii="Microsoft YaHei" w:hAnsi="Microsoft YaHei" w:eastAsia="Microsoft YaHei" w:cs="Microsoft YaHei"/>
+          <w:b/>
+          <w:color w:val="1F4E79"/>
+          <w:sz w:val="28"/>
+        </w:rPr>
+        <w:t>门户十分钟试用反馈</w:t>
+      </w:r>
+    </w:p>
+    <w:p>
+      <w:pPr>
+        <w:spacing w:after="100"/>
+      </w:pPr>
+      <w:r>
+        <w:rPr>
+          <w:rFonts w:ascii="Microsoft YaHei" w:hAnsi="Microsoft YaHei" w:eastAsia="Microsoft YaHei" w:cs="Microsoft YaHei"/>
+          <w:b w:val="0"/>
+          <w:sz w:val="21"/>
+        </w:rPr>
+        <w:t>如方便，请用约十分钟从门户首页进入采购部，再打开已有的 SC2 周报或采购相关页面。只体验导航、检索和页面查看；不上传采购记录、不触发重算，也不需要截图。下面四题勾选或判断，后四题用短句回答；未体验的项目可写“未试”。这些意见用于改进页面体验，不改变本信的 SC2 口径，也不替代真实案例核对。</w:t>
+      </w:r>
+    </w:p>
+    <w:p>
+      <w:pPr>
+        <w:pStyle w:val="Heading3"/>
+        <w:spacing w:before="180" w:after="120"/>
+      </w:pPr>
+      <w:r>
+        <w:rPr>
+          <w:rFonts w:ascii="Microsoft YaHei" w:hAnsi="Microsoft YaHei" w:eastAsia="Microsoft YaHei" w:cs="Microsoft YaHei"/>
+          <w:b/>
+          <w:color w:val="2E5B8A"/>
+          <w:sz w:val="25"/>
+        </w:rPr>
+        <w:t>选择或判断</w:t>
+      </w:r>
+    </w:p>
+    <w:tbl>
+      <w:tblPr>
+        <w:tblW w:type="auto" w:w="0"/>
+        <w:jc w:val="center"/>
+        <w:tblLayout w:type="autofit"/>
+        <w:tblLook w:firstColumn="1" w:firstRow="1" w:lastColumn="0" w:lastRow="0" w:noHBand="0" w:noVBand="1" w:val="04A0"/>
+      </w:tblPr>
+      <w:tblGrid>
+        <w:gridCol w:w="4680"/>
+        <w:gridCol w:w="4680"/>
+      </w:tblGrid>
+      <w:tr>
+        <w:tc>
+          <w:tcPr>
+            <w:tcW w:type="dxa" w:w="4680"/>
+            <w:tcBorders>
+              <w:top w:val="single" w:sz="4" w:space="0" w:color="BBBBBB"/>
+              <w:left w:val="single" w:sz="4" w:space="0" w:color="BBBBBB"/>
+              <w:bottom w:val="single" w:sz="4" w:space="0" w:color="BBBBBB"/>
+              <w:right w:val="single" w:sz="4" w:space="0" w:color="BBBBBB"/>
+            </w:tcBorders>
+            <w:shd w:val="clear" w:color="auto" w:fill="1F4E79"/>
+          </w:tcPr>
+          <w:p>
+            <w:pPr>
+              <w:spacing w:before="0" w:after="0" w:line="240" w:lineRule="auto"/>
+              <w:jc w:val="center"/>
+            </w:pPr>
+            <w:r>
+              <w:rPr>
+                <w:rFonts w:ascii="Microsoft YaHei" w:hAnsi="Microsoft YaHei" w:eastAsia="Microsoft YaHei" w:cs="Microsoft YaHei"/>
+                <w:b/>
+                <w:color w:val="FFFFFF"/>
+                <w:sz w:val="19"/>
+              </w:rPr>
+              <w:t>题目</w:t>
+            </w:r>
+          </w:p>
+        </w:tc>
+        <w:tc>
+          <w:tcPr>
+            <w:tcW w:type="dxa" w:w="4680"/>
+            <w:tcBorders>
+              <w:top w:val="single" w:sz="4" w:space="0" w:color="BBBBBB"/>
+              <w:left w:val="single" w:sz="4" w:space="0" w:color="BBBBBB"/>
+              <w:bottom w:val="single" w:sz="4" w:space="0" w:color="BBBBBB"/>
+              <w:right w:val="single" w:sz="4" w:space="0" w:color="BBBBBB"/>
+            </w:tcBorders>
+            <w:shd w:val="clear" w:color="auto" w:fill="1F4E79"/>
+          </w:tcPr>
+          <w:p>
+            <w:pPr>
+              <w:spacing w:before="0" w:after="0" w:line="240" w:lineRule="auto"/>
+              <w:jc w:val="center"/>
+            </w:pPr>
+            <w:r>
+              <w:rPr>
+                <w:rFonts w:ascii="Microsoft YaHei" w:hAnsi="Microsoft YaHei" w:eastAsia="Microsoft YaHei" w:cs="Microsoft YaHei"/>
+                <w:b/>
+                <w:color w:val="FFFFFF"/>
+                <w:sz w:val="19"/>
+              </w:rPr>
+              <w:t>请选择一项</w:t>
+            </w:r>
+          </w:p>
+        </w:tc>
+      </w:tr>
+      <w:tr>
+        <w:tc>
+          <w:tcPr>
+            <w:tcW w:type="dxa" w:w="4680"/>
+            <w:tcBorders>
+              <w:top w:val="single" w:sz="4" w:space="0" w:color="BBBBBB"/>
+              <w:left w:val="single" w:sz="4" w:space="0" w:color="BBBBBB"/>
+              <w:bottom w:val="single" w:sz="4" w:space="0" w:color="BBBBBB"/>
+              <w:right w:val="single" w:sz="4" w:space="0" w:color="BBBBBB"/>
+            </w:tcBorders>
+          </w:tcPr>
+          <w:p>
+            <w:pPr>
+              <w:spacing w:before="0" w:after="0" w:line="240" w:lineRule="auto"/>
+            </w:pPr>
+            <w:r>
+              <w:rPr>
+                <w:rFonts w:ascii="Microsoft YaHei" w:hAnsi="Microsoft YaHei" w:eastAsia="Microsoft YaHei" w:cs="Microsoft YaHei"/>
+                <w:b w:val="0"/>
+                <w:sz w:val="18"/>
+              </w:rPr>
+              <w:t>1. 你是否在十分钟内从首页找到采购部入口？</w:t>
+            </w:r>
+          </w:p>
+        </w:tc>
+        <w:tc>
+          <w:tcPr>
+            <w:tcW w:type="dxa" w:w="4680"/>
+            <w:tcBorders>
+              <w:top w:val="single" w:sz="4" w:space="0" w:color="BBBBBB"/>
+              <w:left w:val="single" w:sz="4" w:space="0" w:color="BBBBBB"/>
+              <w:bottom w:val="single" w:sz="4" w:space="0" w:color="BBBBBB"/>
+              <w:right w:val="single" w:sz="4" w:space="0" w:color="BBBBBB"/>
+            </w:tcBorders>
+          </w:tcPr>
+          <w:p>
+            <w:pPr>
+              <w:spacing w:before="0" w:after="0" w:line="240" w:lineRule="auto"/>
+            </w:pPr>
+            <w:sdt>
+              <w:sdtPr>
+                <w:rPr>
+                  <w:rFonts w:ascii="MS Gothic" w:eastAsia="MS Gothic" w:hAnsi="MS Gothic" w:cs="MS Gothic"/>
+                  <w:sz w:val="18"/>
+                </w:rPr>
+                <w:id w:val="100000001"/>
+                <w14:checkbox>
+                  <w14:checked w14:val="0"/>
+                  <w14:checkedState w14:val="2611" w14:font="MS Gothic"/>
+                  <w14:uncheckedState w14:val="2610" w14:font="MS Gothic"/>
+                </w14:checkbox>
+              </w:sdtPr>
+              <w:sdtEndPr/>
+              <w:sdtContent>
+                <w:r>
+                  <w:rPr>
+                    <w:rFonts w:ascii="MS Gothic" w:eastAsia="MS Gothic" w:hAnsi="MS Gothic" w:cs="MS Gothic"/>
+                    <w:sz w:val="18"/>
+                  </w:rPr>
+                  <w:t>☐</w:t>
+                </w:r>
+              </w:sdtContent>
+            </w:sdt>
+            <w:r>
+              <w:rPr>
+                <w:rFonts w:ascii="Microsoft YaHei" w:hAnsi="Microsoft YaHei" w:eastAsia="Microsoft YaHei" w:cs="Microsoft YaHei"/>
+                <w:b w:val="0"/>
+                <w:sz w:val="18"/>
+              </w:rPr>
+              <w:t xml:space="preserve"> 是　</w:t>
+            </w:r>
+            <w:sdt>
+              <w:sdtPr>
+                <w:rPr>
+                  <w:rFonts w:ascii="MS Gothic" w:eastAsia="MS Gothic" w:hAnsi="MS Gothic" w:cs="MS Gothic"/>
+                  <w:sz w:val="18"/>
+                </w:rPr>
+                <w:id w:val="100000002"/>
+                <w14:checkbox>
+                  <w14:checked w14:val="0"/>
+                  <w14:checkedState w14:val="2611" w14:font="MS Gothic"/>
+                  <w14:uncheckedState w14:val="2610" w14:font="MS Gothic"/>
+                </w14:checkbox>
+              </w:sdtPr>
+              <w:sdtEndPr/>
+              <w:sdtContent>
+                <w:r>
+                  <w:rPr>
+                    <w:rFonts w:ascii="MS Gothic" w:eastAsia="MS Gothic" w:hAnsi="MS Gothic" w:cs="MS Gothic"/>
+                    <w:sz w:val="18"/>
+                  </w:rPr>
+                  <w:t>☐</w:t>
+                </w:r>
+              </w:sdtContent>
+            </w:sdt>
+            <w:r>
+              <w:rPr>
+                <w:rFonts w:ascii="Microsoft YaHei" w:hAnsi="Microsoft YaHei" w:eastAsia="Microsoft YaHei" w:cs="Microsoft YaHei"/>
+                <w:b w:val="0"/>
+                <w:sz w:val="18"/>
+              </w:rPr>
+              <w:t xml:space="preserve"> 否　</w:t>
+            </w:r>
+            <w:sdt>
+              <w:sdtPr>
+                <w:rPr>
+                  <w:rFonts w:ascii="MS Gothic" w:eastAsia="MS Gothic" w:hAnsi="MS Gothic" w:cs="MS Gothic"/>
+                  <w:sz w:val="18"/>
+                </w:rPr>
+                <w:id w:val="100000003"/>
+                <w14:checkbox>
+                  <w14:checked w14:val="0"/>
+                  <w14:checkedState w14:val="2611" w14:font="MS Gothic"/>
+                  <w14:uncheckedState w14:val="2610" w14:font="MS Gothic"/>
+                </w14:checkbox>
+              </w:sdtPr>
+              <w:sdtEndPr/>
+              <w:sdtContent>
+                <w:r>
+                  <w:rPr>
+                    <w:rFonts w:ascii="MS Gothic" w:eastAsia="MS Gothic" w:hAnsi="MS Gothic" w:cs="MS Gothic"/>
+                    <w:sz w:val="18"/>
+                  </w:rPr>
+                  <w:t>☐</w:t>
+                </w:r>
+              </w:sdtContent>
+            </w:sdt>
+            <w:r>
+              <w:rPr>
+                <w:rFonts w:ascii="Microsoft YaHei" w:hAnsi="Microsoft YaHei" w:eastAsia="Microsoft YaHei" w:cs="Microsoft YaHei"/>
+                <w:b w:val="0"/>
+                <w:sz w:val="18"/>
+              </w:rPr>
+              <w:t xml:space="preserve"> 未试</w:t>
+            </w:r>
+          </w:p>
+        </w:tc>
+      </w:tr>
+      <w:tr>
+        <w:tc>
+          <w:tcPr>
+            <w:tcW w:type="dxa" w:w="4680"/>
+            <w:tcBorders>
+              <w:top w:val="single" w:sz="4" w:space="0" w:color="BBBBBB"/>
+              <w:left w:val="single" w:sz="4" w:space="0" w:color="BBBBBB"/>
+              <w:bottom w:val="single" w:sz="4" w:space="0" w:color="BBBBBB"/>
+              <w:right w:val="single" w:sz="4" w:space="0" w:color="BBBBBB"/>
+            </w:tcBorders>
+            <w:shd w:val="clear" w:color="auto" w:fill="F2F6FB"/>
+          </w:tcPr>
+          <w:p>
+            <w:pPr>
+              <w:spacing w:before="0" w:after="0" w:line="240" w:lineRule="auto"/>
+            </w:pPr>
+            <w:r>
+              <w:rPr>
+                <w:rFonts w:ascii="Microsoft YaHei" w:hAnsi="Microsoft YaHei" w:eastAsia="Microsoft YaHei" w:cs="Microsoft YaHei"/>
+                <w:b w:val="0"/>
+                <w:sz w:val="18"/>
+              </w:rPr>
+              <w:t>2. 你是否能从采购部入口打开已有的 SC2 周报或相关页面？</w:t>
+            </w:r>
+          </w:p>
+        </w:tc>
+        <w:tc>
+          <w:tcPr>
+            <w:tcW w:type="dxa" w:w="4680"/>
+            <w:tcBorders>
+              <w:top w:val="single" w:sz="4" w:space="0" w:color="BBBBBB"/>
+              <w:left w:val="single" w:sz="4" w:space="0" w:color="BBBBBB"/>
+              <w:bottom w:val="single" w:sz="4" w:space="0" w:color="BBBBBB"/>
+              <w:right w:val="single" w:sz="4" w:space="0" w:color="BBBBBB"/>
+            </w:tcBorders>
+            <w:shd w:val="clear" w:color="auto" w:fill="F2F6FB"/>
+          </w:tcPr>
+          <w:p>
+            <w:pPr>
+              <w:spacing w:before="0" w:after="0" w:line="240" w:lineRule="auto"/>
+            </w:pPr>
+            <w:sdt>
+              <w:sdtPr>
+                <w:rPr>
+                  <w:rFonts w:ascii="MS Gothic" w:eastAsia="MS Gothic" w:hAnsi="MS Gothic" w:cs="MS Gothic"/>
+                  <w:sz w:val="18"/>
+                </w:rPr>
+                <w:id w:val="100000004"/>
+                <w14:checkbox>
+                  <w14:checked w14:val="0"/>
+                  <w14:checkedState w14:val="2611" w14:font="MS Gothic"/>
+                  <w14:uncheckedState w14:val="2610" w14:font="MS Gothic"/>
+                </w14:checkbox>
+              </w:sdtPr>
+              <w:sdtEndPr/>
+              <w:sdtContent>
+                <w:r>
+                  <w:rPr>
+                    <w:rFonts w:ascii="MS Gothic" w:eastAsia="MS Gothic" w:hAnsi="MS Gothic" w:cs="MS Gothic"/>
+                    <w:sz w:val="18"/>
+                  </w:rPr>
+                  <w:t>☐</w:t>
+                </w:r>
+              </w:sdtContent>
+            </w:sdt>
+            <w:r>
+              <w:rPr>
+                <w:rFonts w:ascii="Microsoft YaHei" w:hAnsi="Microsoft YaHei" w:eastAsia="Microsoft YaHei" w:cs="Microsoft YaHei"/>
+                <w:b w:val="0"/>
+                <w:sz w:val="18"/>
+              </w:rPr>
+              <w:t xml:space="preserve"> 是　</w:t>
+            </w:r>
+            <w:sdt>
+              <w:sdtPr>
+                <w:rPr>
+                  <w:rFonts w:ascii="MS Gothic" w:eastAsia="MS Gothic" w:hAnsi="MS Gothic" w:cs="MS Gothic"/>
+                  <w:sz w:val="18"/>
+                </w:rPr>
+                <w:id w:val="100000005"/>
+                <w14:checkbox>
+                  <w14:checked w14:val="0"/>
+                  <w14:checkedState w14:val="2611" w14:font="MS Gothic"/>
+                  <w14:uncheckedState w14:val="2610" w14:font="MS Gothic"/>
+                </w14:checkbox>
+              </w:sdtPr>
+              <w:sdtEndPr/>
+              <w:sdtContent>
+                <w:r>
+                  <w:rPr>
+                    <w:rFonts w:ascii="MS Gothic" w:eastAsia="MS Gothic" w:hAnsi="MS Gothic" w:cs="MS Gothic"/>
+                    <w:sz w:val="18"/>
+                  </w:rPr>
+                  <w:t>☐</w:t>
+                </w:r>
+              </w:sdtContent>
+            </w:sdt>
+            <w:r>
+              <w:rPr>
+                <w:rFonts w:ascii="Microsoft YaHei" w:hAnsi="Microsoft YaHei" w:eastAsia="Microsoft YaHei" w:cs="Microsoft YaHei"/>
+                <w:b w:val="0"/>
+                <w:sz w:val="18"/>
+              </w:rPr>
+              <w:t xml:space="preserve"> 否　</w:t>
+            </w:r>
+            <w:sdt>
+              <w:sdtPr>
+                <w:rPr>
+                  <w:rFonts w:ascii="MS Gothic" w:eastAsia="MS Gothic" w:hAnsi="MS Gothic" w:cs="MS Gothic"/>
+                  <w:sz w:val="18"/>
+                </w:rPr>
+                <w:id w:val="100000006"/>
+                <w14:checkbox>
+                  <w14:checked w14:val="0"/>
+                  <w14:checkedState w14:val="2611" w14:font="MS Gothic"/>
+                  <w14:uncheckedState w14:val="2610" w14:font="MS Gothic"/>
+                </w14:checkbox>
+              </w:sdtPr>
+              <w:sdtEndPr/>
+              <w:sdtContent>
+                <w:r>
+                  <w:rPr>
+                    <w:rFonts w:ascii="MS Gothic" w:eastAsia="MS Gothic" w:hAnsi="MS Gothic" w:cs="MS Gothic"/>
+                    <w:sz w:val="18"/>
+                  </w:rPr>
+                  <w:t>☐</w:t>
+                </w:r>
+              </w:sdtContent>
+            </w:sdt>
+            <w:r>
+              <w:rPr>
+                <w:rFonts w:ascii="Microsoft YaHei" w:hAnsi="Microsoft YaHei" w:eastAsia="Microsoft YaHei" w:cs="Microsoft YaHei"/>
+                <w:b w:val="0"/>
+                <w:sz w:val="18"/>
+              </w:rPr>
+              <w:t xml:space="preserve"> 未试</w:t>
+            </w:r>
+          </w:p>
+        </w:tc>
+      </w:tr>
+      <w:tr>
+        <w:tc>
+          <w:tcPr>
+            <w:tcW w:type="dxa" w:w="4680"/>
+            <w:tcBorders>
+              <w:top w:val="single" w:sz="4" w:space="0" w:color="BBBBBB"/>
+              <w:left w:val="single" w:sz="4" w:space="0" w:color="BBBBBB"/>
+              <w:bottom w:val="single" w:sz="4" w:space="0" w:color="BBBBBB"/>
+              <w:right w:val="single" w:sz="4" w:space="0" w:color="BBBBBB"/>
+            </w:tcBorders>
+          </w:tcPr>
+          <w:p>
+            <w:pPr>
+              <w:spacing w:before="0" w:after="0" w:line="240" w:lineRule="auto"/>
+            </w:pPr>
+            <w:r>
+              <w:rPr>
+                <w:rFonts w:ascii="Microsoft YaHei" w:hAnsi="Microsoft YaHei" w:eastAsia="Microsoft YaHei" w:cs="Microsoft YaHei"/>
+                <w:b w:val="0"/>
+                <w:sz w:val="18"/>
+              </w:rPr>
+              <w:t>3. 如使用门户检索，结果是否带你到预期的现有页面？</w:t>
+            </w:r>
+          </w:p>
+        </w:tc>
+        <w:tc>
+          <w:tcPr>
+            <w:tcW w:type="dxa" w:w="4680"/>
+            <w:tcBorders>
+              <w:top w:val="single" w:sz="4" w:space="0" w:color="BBBBBB"/>
+              <w:left w:val="single" w:sz="4" w:space="0" w:color="BBBBBB"/>
+              <w:bottom w:val="single" w:sz="4" w:space="0" w:color="BBBBBB"/>
+              <w:right w:val="single" w:sz="4" w:space="0" w:color="BBBBBB"/>
+            </w:tcBorders>
+          </w:tcPr>
+          <w:p>
+            <w:pPr>
+              <w:spacing w:before="0" w:after="0" w:line="240" w:lineRule="auto"/>
+            </w:pPr>
+            <w:sdt>
+              <w:sdtPr>
+                <w:rPr>
+                  <w:rFonts w:ascii="MS Gothic" w:eastAsia="MS Gothic" w:hAnsi="MS Gothic" w:cs="MS Gothic"/>
+                  <w:sz w:val="18"/>
+                </w:rPr>
+                <w:id w:val="100000007"/>
+                <w14:checkbox>
+                  <w14:checked w14:val="0"/>
+                  <w14:checkedState w14:val="2611" w14:font="MS Gothic"/>
+                  <w14:uncheckedState w14:val="2610" w14:font="MS Gothic"/>
+                </w14:checkbox>
+              </w:sdtPr>
+              <w:sdtEndPr/>
+              <w:sdtContent>
+                <w:r>
+                  <w:rPr>
+                    <w:rFonts w:ascii="MS Gothic" w:eastAsia="MS Gothic" w:hAnsi="MS Gothic" w:cs="MS Gothic"/>
+                    <w:sz w:val="18"/>
+                  </w:rPr>
+                  <w:t>☐</w:t>
+                </w:r>
+              </w:sdtContent>
+            </w:sdt>
+            <w:r>
+              <w:rPr>
+                <w:rFonts w:ascii="Microsoft YaHei" w:hAnsi="Microsoft YaHei" w:eastAsia="Microsoft YaHei" w:cs="Microsoft YaHei"/>
+                <w:b w:val="0"/>
+                <w:sz w:val="18"/>
+              </w:rPr>
+              <w:t xml:space="preserve"> 是　</w:t>
+            </w:r>
+            <w:sdt>
+              <w:sdtPr>
+                <w:rPr>
+                  <w:rFonts w:ascii="MS Gothic" w:eastAsia="MS Gothic" w:hAnsi="MS Gothic" w:cs="MS Gothic"/>
+                  <w:sz w:val="18"/>
+                </w:rPr>
+                <w:id w:val="100000008"/>
+                <w14:checkbox>
+                  <w14:checked w14:val="0"/>
+                  <w14:checkedState w14:val="2611" w14:font="MS Gothic"/>
+                  <w14:uncheckedState w14:val="2610" w14:font="MS Gothic"/>
+                </w14:checkbox>
+              </w:sdtPr>
+              <w:sdtEndPr/>
+              <w:sdtContent>
+                <w:r>
+                  <w:rPr>
+                    <w:rFonts w:ascii="MS Gothic" w:eastAsia="MS Gothic" w:hAnsi="MS Gothic" w:cs="MS Gothic"/>
+                    <w:sz w:val="18"/>
+                  </w:rPr>
+                  <w:t>☐</w:t>
+                </w:r>
+              </w:sdtContent>
+            </w:sdt>
+            <w:r>
+              <w:rPr>
+                <w:rFonts w:ascii="Microsoft YaHei" w:hAnsi="Microsoft YaHei" w:eastAsia="Microsoft YaHei" w:cs="Microsoft YaHei"/>
+                <w:b w:val="0"/>
+                <w:sz w:val="18"/>
+              </w:rPr>
+              <w:t xml:space="preserve"> 否　</w:t>
+            </w:r>
+            <w:sdt>
+              <w:sdtPr>
+                <w:rPr>
+                  <w:rFonts w:ascii="MS Gothic" w:eastAsia="MS Gothic" w:hAnsi="MS Gothic" w:cs="MS Gothic"/>
+                  <w:sz w:val="18"/>
+                </w:rPr>
+                <w:id w:val="100000009"/>
+                <w14:checkbox>
+                  <w14:checked w14:val="0"/>
+                  <w14:checkedState w14:val="2611" w14:font="MS Gothic"/>
+                  <w14:uncheckedState w14:val="2610" w14:font="MS Gothic"/>
+                </w14:checkbox>
+              </w:sdtPr>
+              <w:sdtEndPr/>
+              <w:sdtContent>
+                <w:r>
+                  <w:rPr>
+                    <w:rFonts w:ascii="MS Gothic" w:eastAsia="MS Gothic" w:hAnsi="MS Gothic" w:cs="MS Gothic"/>
+                    <w:sz w:val="18"/>
+                  </w:rPr>
+                  <w:t>☐</w:t>
+                </w:r>
+              </w:sdtContent>
+            </w:sdt>
+            <w:r>
+              <w:rPr>
+                <w:rFonts w:ascii="Microsoft YaHei" w:hAnsi="Microsoft YaHei" w:eastAsia="Microsoft YaHei" w:cs="Microsoft YaHei"/>
+                <w:b w:val="0"/>
+                <w:sz w:val="18"/>
+              </w:rPr>
+              <w:t xml:space="preserve"> 未试</w:t>
+            </w:r>
+          </w:p>
+        </w:tc>
+      </w:tr>
+      <w:tr>
+        <w:tc>
+          <w:tcPr>
+            <w:tcW w:type="dxa" w:w="4680"/>
+            <w:tcBorders>
+              <w:top w:val="single" w:sz="4" w:space="0" w:color="BBBBBB"/>
+              <w:left w:val="single" w:sz="4" w:space="0" w:color="BBBBBB"/>
+              <w:bottom w:val="single" w:sz="4" w:space="0" w:color="BBBBBB"/>
+              <w:right w:val="single" w:sz="4" w:space="0" w:color="BBBBBB"/>
+            </w:tcBorders>
+            <w:shd w:val="clear" w:color="auto" w:fill="F2F6FB"/>
+          </w:tcPr>
+          <w:p>
+            <w:pPr>
+              <w:spacing w:before="0" w:after="0" w:line="240" w:lineRule="auto"/>
+            </w:pPr>
+            <w:r>
+              <w:rPr>
+                <w:rFonts w:ascii="Microsoft YaHei" w:hAnsi="Microsoft YaHei" w:eastAsia="Microsoft YaHei" w:cs="Microsoft YaHei"/>
+                <w:b w:val="0"/>
+                <w:sz w:val="18"/>
+              </w:rPr>
+              <w:t>4. 页面上的来源和更新时间是否足以让你判断信息的新旧？</w:t>
+            </w:r>
+          </w:p>
+        </w:tc>
+        <w:tc>
+          <w:tcPr>
+            <w:tcW w:type="dxa" w:w="4680"/>
+            <w:tcBorders>
+              <w:top w:val="single" w:sz="4" w:space="0" w:color="BBBBBB"/>
+              <w:left w:val="single" w:sz="4" w:space="0" w:color="BBBBBB"/>
+              <w:bottom w:val="single" w:sz="4" w:space="0" w:color="BBBBBB"/>
+              <w:right w:val="single" w:sz="4" w:space="0" w:color="BBBBBB"/>
+            </w:tcBorders>
+            <w:shd w:val="clear" w:color="auto" w:fill="F2F6FB"/>
+          </w:tcPr>
+          <w:p>
+            <w:pPr>
+              <w:spacing w:before="0" w:after="0" w:line="240" w:lineRule="auto"/>
+            </w:pPr>
+            <w:sdt>
+              <w:sdtPr>
+                <w:rPr>
+                  <w:rFonts w:ascii="MS Gothic" w:eastAsia="MS Gothic" w:hAnsi="MS Gothic" w:cs="MS Gothic"/>
+                  <w:sz w:val="18"/>
+                </w:rPr>
+                <w:id w:val="100000010"/>
+                <w14:checkbox>
+                  <w14:checked w14:val="0"/>
+                  <w14:checkedState w14:val="2611" w14:font="MS Gothic"/>
+                  <w14:uncheckedState w14:val="2610" w14:font="MS Gothic"/>
+                </w14:checkbox>
+              </w:sdtPr>
+              <w:sdtEndPr/>
+              <w:sdtContent>
+                <w:r>
+                  <w:rPr>
+                    <w:rFonts w:ascii="MS Gothic" w:eastAsia="MS Gothic" w:hAnsi="MS Gothic" w:cs="MS Gothic"/>
+                    <w:sz w:val="18"/>
+                  </w:rPr>
+                  <w:t>☐</w:t>
+                </w:r>
+              </w:sdtContent>
+            </w:sdt>
+            <w:r>
+              <w:rPr>
+                <w:rFonts w:ascii="Microsoft YaHei" w:hAnsi="Microsoft YaHei" w:eastAsia="Microsoft YaHei" w:cs="Microsoft YaHei"/>
+                <w:b w:val="0"/>
+                <w:sz w:val="18"/>
+              </w:rPr>
+              <w:t xml:space="preserve"> 是　</w:t>
+            </w:r>
+            <w:sdt>
+              <w:sdtPr>
+                <w:rPr>
+                  <w:rFonts w:ascii="MS Gothic" w:eastAsia="MS Gothic" w:hAnsi="MS Gothic" w:cs="MS Gothic"/>
+                  <w:sz w:val="18"/>
+                </w:rPr>
+                <w:id w:val="100000011"/>
+                <w14:checkbox>
+                  <w14:checked w14:val="0"/>
+                  <w14:checkedState w14:val="2611" w14:font="MS Gothic"/>
+                  <w14:uncheckedState w14:val="2610" w14:font="MS Gothic"/>
+                </w14:checkbox>
+              </w:sdtPr>
+              <w:sdtEndPr/>
+              <w:sdtContent>
+                <w:r>
+                  <w:rPr>
+                    <w:rFonts w:ascii="MS Gothic" w:eastAsia="MS Gothic" w:hAnsi="MS Gothic" w:cs="MS Gothic"/>
+                    <w:sz w:val="18"/>
+                  </w:rPr>
+                  <w:t>☐</w:t>
+                </w:r>
+              </w:sdtContent>
+            </w:sdt>
+            <w:r>
+              <w:rPr>
+                <w:rFonts w:ascii="Microsoft YaHei" w:hAnsi="Microsoft YaHei" w:eastAsia="Microsoft YaHei" w:cs="Microsoft YaHei"/>
+                <w:b w:val="0"/>
+                <w:sz w:val="18"/>
+              </w:rPr>
+              <w:t xml:space="preserve"> 否　</w:t>
+            </w:r>
+            <w:sdt>
+              <w:sdtPr>
+                <w:rPr>
+                  <w:rFonts w:ascii="MS Gothic" w:eastAsia="MS Gothic" w:hAnsi="MS Gothic" w:cs="MS Gothic"/>
+                  <w:sz w:val="18"/>
+                </w:rPr>
+                <w:id w:val="100000012"/>
+                <w14:checkbox>
+                  <w14:checked w14:val="0"/>
+                  <w14:checkedState w14:val="2611" w14:font="MS Gothic"/>
+                  <w14:uncheckedState w14:val="2610" w14:font="MS Gothic"/>
+                </w14:checkbox>
+              </w:sdtPr>
+              <w:sdtEndPr/>
+              <w:sdtContent>
+                <w:r>
+                  <w:rPr>
+                    <w:rFonts w:ascii="MS Gothic" w:eastAsia="MS Gothic" w:hAnsi="MS Gothic" w:cs="MS Gothic"/>
+                    <w:sz w:val="18"/>
+                  </w:rPr>
+                  <w:t>☐</w:t>
+                </w:r>
+              </w:sdtContent>
+            </w:sdt>
+            <w:r>
+              <w:rPr>
+                <w:rFonts w:ascii="Microsoft YaHei" w:hAnsi="Microsoft YaHei" w:eastAsia="Microsoft YaHei" w:cs="Microsoft YaHei"/>
+                <w:b w:val="0"/>
+                <w:sz w:val="18"/>
+              </w:rPr>
+              <w:t xml:space="preserve"> 不清楚　</w:t>
+            </w:r>
+            <w:sdt>
+              <w:sdtPr>
+                <w:rPr>
+                  <w:rFonts w:ascii="MS Gothic" w:eastAsia="MS Gothic" w:hAnsi="MS Gothic" w:cs="MS Gothic"/>
+                  <w:sz w:val="18"/>
+                </w:rPr>
+                <w:id w:val="100000013"/>
+                <w14:checkbox>
+                  <w14:checked w14:val="0"/>
+                  <w14:checkedState w14:val="2611" w14:font="MS Gothic"/>
+                  <w14:uncheckedState w14:val="2610" w14:font="MS Gothic"/>
+                </w14:checkbox>
+              </w:sdtPr>
+              <w:sdtEndPr/>
+              <w:sdtContent>
+                <w:r>
+                  <w:rPr>
+                    <w:rFonts w:ascii="MS Gothic" w:eastAsia="MS Gothic" w:hAnsi="MS Gothic" w:cs="MS Gothic"/>
+                    <w:sz w:val="18"/>
+                  </w:rPr>
+                  <w:t>☐</w:t>
+                </w:r>
+              </w:sdtContent>
+            </w:sdt>
+            <w:r>
+              <w:rPr>
+                <w:rFonts w:ascii="Microsoft YaHei" w:hAnsi="Microsoft YaHei" w:eastAsia="Microsoft YaHei" w:cs="Microsoft YaHei"/>
+                <w:b w:val="0"/>
+                <w:sz w:val="18"/>
+              </w:rPr>
+              <w:t xml:space="preserve"> 未试</w:t>
+            </w:r>
+          </w:p>
+        </w:tc>
+      </w:tr>
+    </w:tbl>
+    <w:p>
+      <w:pPr>
+        <w:spacing w:after="40"/>
+      </w:pPr>
+    </w:p>
+    <w:p>
+      <w:pPr>
+        <w:pStyle w:val="Heading3"/>
+        <w:spacing w:before="180" w:after="120"/>
+      </w:pPr>
+      <w:r>
+        <w:rPr>
+          <w:rFonts w:ascii="Microsoft YaHei" w:hAnsi="Microsoft YaHei" w:eastAsia="Microsoft YaHei" w:cs="Microsoft YaHei"/>
+          <w:b/>
+          <w:color w:val="2E5B8A"/>
+          <w:sz w:val="25"/>
+        </w:rPr>
+        <w:t>简答</w:t>
+      </w:r>
+    </w:p>
+    <w:p>
+      <w:pPr>
+        <w:pStyle w:val="ListNumber"/>
+        <w:spacing w:after="60"/>
+      </w:pPr>
+      <w:r>
+        <w:rPr>
+          <w:rFonts w:ascii="Microsoft YaHei" w:hAnsi="Microsoft YaHei" w:eastAsia="Microsoft YaHei" w:cs="Microsoft YaHei"/>
+          <w:b w:val="0"/>
+          <w:sz w:val="21"/>
+        </w:rPr>
+        <w:t>从首页到采购页面，哪一步最花时间或最难找？</w:t>
+      </w:r>
+    </w:p>
+    <w:p>
+      <w:pPr>
+        <w:spacing w:after="100"/>
+      </w:pPr>
+      <w:r>
+        <w:rPr>
+          <w:rFonts w:ascii="Microsoft YaHei" w:hAnsi="Microsoft YaHei" w:eastAsia="Microsoft YaHei" w:cs="Microsoft YaHei"/>
+          <w:b w:val="0"/>
+          <w:sz w:val="21"/>
+        </w:rPr>
+        <w:t>答：</w:t>
+      </w:r>
+    </w:p>
+    <w:p>
+      <w:pPr>
+        <w:pStyle w:val="ListNumber"/>
+        <w:spacing w:after="60"/>
+      </w:pPr>
+      <w:r>
+        <w:rPr>
+          <w:rFonts w:ascii="Microsoft YaHei" w:hAnsi="Microsoft YaHei" w:eastAsia="Microsoft YaHei" w:cs="Microsoft YaHei"/>
+          <w:b w:val="0"/>
+          <w:sz w:val="21"/>
+        </w:rPr>
+        <w:t>如使用检索，你输入了什么词？结果与你预期有什么差别？</w:t>
+      </w:r>
+    </w:p>
+    <w:p>
+      <w:pPr>
+        <w:spacing w:after="100"/>
+      </w:pPr>
+      <w:r>
+        <w:rPr>
+          <w:rFonts w:ascii="Microsoft YaHei" w:hAnsi="Microsoft YaHei" w:eastAsia="Microsoft YaHei" w:cs="Microsoft YaHei"/>
+          <w:b w:val="0"/>
+          <w:sz w:val="21"/>
+        </w:rPr>
+        <w:t>答：</w:t>
+      </w:r>
+    </w:p>
+    <w:p>
+      <w:pPr>
+        <w:pStyle w:val="ListNumber"/>
+        <w:spacing w:after="60"/>
+      </w:pPr>
+      <w:r>
+        <w:rPr>
+          <w:rFonts w:ascii="Microsoft YaHei" w:hAnsi="Microsoft YaHei" w:eastAsia="Microsoft YaHei" w:cs="Microsoft YaHei"/>
+          <w:b w:val="0"/>
+          <w:sz w:val="21"/>
+        </w:rPr>
+        <w:t>如用手机查看，哪一处不顺手？未用手机可写“未试”。</w:t>
+      </w:r>
+    </w:p>
+    <w:p>
+      <w:pPr>
+        <w:spacing w:after="100"/>
+      </w:pPr>
+      <w:r>
+        <w:rPr>
+          <w:rFonts w:ascii="Microsoft YaHei" w:hAnsi="Microsoft YaHei" w:eastAsia="Microsoft YaHei" w:cs="Microsoft YaHei"/>
+          <w:b w:val="0"/>
+          <w:sz w:val="21"/>
+        </w:rPr>
+        <w:t>答：</w:t>
+      </w:r>
+    </w:p>
+    <w:p>
+      <w:pPr>
+        <w:pStyle w:val="ListNumber"/>
+        <w:spacing w:after="60"/>
+      </w:pPr>
+      <w:r>
+        <w:rPr>
+          <w:rFonts w:ascii="Microsoft YaHei" w:hAnsi="Microsoft YaHei" w:eastAsia="Microsoft YaHei" w:cs="Microsoft YaHei"/>
+          <w:b w:val="0"/>
+          <w:sz w:val="21"/>
+        </w:rPr>
+        <w:t>来源或更新时间还缺少什么说明，才便于你判断页面信息？</w:t>
+      </w:r>
+    </w:p>
+    <w:p>
+      <w:pPr>
+        <w:spacing w:after="100"/>
+      </w:pPr>
+      <w:r>
+        <w:rPr>
+          <w:rFonts w:ascii="Microsoft YaHei" w:hAnsi="Microsoft YaHei" w:eastAsia="Microsoft YaHei" w:cs="Microsoft YaHei"/>
+          <w:b w:val="0"/>
+          <w:sz w:val="21"/>
+        </w:rPr>
+        <w:t>答：</w:t>
+      </w:r>
+    </w:p>
+    <w:p>
+      <w:pPr>
+        <w:spacing w:after="100"/>
+      </w:pPr>
+      <w:r>
+        <w:rPr>
+          <w:rFonts w:ascii="Microsoft YaHei" w:hAnsi="Microsoft YaHei" w:eastAsia="Microsoft YaHei" w:cs="Microsoft YaHei"/>
+          <w:b w:val="0"/>
+          <w:sz w:val="21"/>
+        </w:rPr>
+        <w:t>如某项还未体验，可留空或写“未试”；无需提供客户资料、采购记录或截图。</w:t>
+      </w:r>
+    </w:p>
+    <w:p>
+      <w:pPr>
         <w:spacing w:after="100"/>
       </w:pPr>
       <w:r>
@@ -353,7 +1193,7 @@
         <w:color w:val="999999"/>
         <w:sz w:val="16"/>
       </w:rPr>
-      <w:t>采购部#25 · SC2真实案例与微会准备</w:t>
+      <w:t>1. 分享一组实际核数记录</w:t>
     </w:r>
   </w:p>
 </w:hdr>

</xml_diff>